<commit_message>
Add ICO target-list workbook; update report with named Axial contacts
- PIVT_ICO_Target_List.xlsx: Apollo-ready import template, "best free seed
  sources" tab (incl. Axial's public independent-sponsor directories and the
  Form D pull), and the Apollo setup + saved-search recipe. Example firms are
  flagged research-sourced / verify-before-outreach and segmented (independent
  sponsor / LMM PE vs. capital provider).
- PIVT_ICO_Outreach_2.docx: Axial section now lists verified named contacts
  (Peter Lehrman CEO, Nick Coetzee, Alfredo Garcia, Mark Romeo) with best-door
  guidance and the SBIA event route; adds the 27%-of-closed-deals stat and a
  pointer to the target-list workbook.

Co-Authored-By: Claude Opus 4.8 <noreply@anthropic.com>
Claude-Session: https://claude.ai/code/session_01EPYUJDdunDDvUAwFbRBByR
</commit_message>
<xml_diff>
--- a/PIVT_ICO_Outreach_2.docx
+++ b/PIVT_ICO_Outreach_2.docx
@@ -2318,7 +2318,42 @@
           <w:sz w:val="21"/>
           <w:szCs w:val="21"/>
         </w:rPr>
-        <w:t xml:space="preserve">, most notably the Small Business Investor Alliance (SBIA), for which Axial is the exclusive online deal-sourcing platform. So “PIVT as a workflow / distribution partner for your independent-sponsor members” is a conversation Axial is structurally set up to have.</w:t>
+        <w:t xml:space="preserve">, most notably the Small Business Investor Alliance (SBIA), for which Axial is the exclusive online deal-sourcing platform. And the fit is striking: </w:t>
+      </w:r>
+      <w:r>
+        <w:rPr>
+          <w:rFonts w:ascii="Calibri" w:cs="Calibri" w:eastAsia="Calibri" w:hAnsi="Calibri"/>
+          <w:b/>
+          <w:bCs/>
+          <w:sz w:val="21"/>
+          <w:szCs w:val="21"/>
+        </w:rPr>
+        <w:t xml:space="preserve">independent sponsors now account for 27% of all closed deals on Axial — the highest share of any buyer type, ahead of PE funds at 20%.</w:t>
+      </w:r>
+      <w:r>
+        <w:rPr>
+          <w:rFonts w:ascii="Calibri" w:cs="Calibri" w:eastAsia="Calibri" w:hAnsi="Calibri"/>
+          <w:sz w:val="21"/>
+          <w:szCs w:val="21"/>
+        </w:rPr>
+        <w:t xml:space="preserve"> That is PIVT's exact ICO. So “PIVT as a workflow / distribution partner for your independent-sponsor members” is a conversation Axial is structurally set up to have.</w:t>
+      </w:r>
+    </w:p>
+    <w:p>
+      <w:pPr>
+        <w:pStyle w:val="Heading2"/>
+        <w:spacing w:after="60" w:before="180"/>
+      </w:pPr>
+      <w:r>
+        <w:rPr>
+          <w:rFonts w:ascii="Calibri" w:cs="Calibri" w:eastAsia="Calibri" w:hAnsi="Calibri"/>
+          <w:b/>
+          <w:bCs/>
+          <w:color w:val="1F3864"/>
+          <w:sz w:val="23"/>
+          <w:szCs w:val="23"/>
+        </w:rPr>
+        <w:t xml:space="preserve">Named people to approach (verified as of July 2026)</w:t>
       </w:r>
     </w:p>
     <w:p>
@@ -2328,6 +2363,442 @@
       <w:r>
         <w:rPr>
           <w:rFonts w:ascii="Calibri" w:cs="Calibri" w:eastAsia="Calibri" w:hAnsi="Calibri"/>
+          <w:sz w:val="21"/>
+          <w:szCs w:val="21"/>
+        </w:rPr>
+        <w:t xml:space="preserve">There is no public “Head of Partnerships” title at Axial today, so the right doors are the CEO (for a strategic channel partnership at PIVT's stage) and the operations / go-to-market leaders. Verify current titles on LinkedIn before reaching out — people move (Axial's former CRO, for instance, has since left).</w:t>
+      </w:r>
+    </w:p>
+    <w:tbl>
+      <w:tblPr>
+        <w:tblW w:type="dxa" w:w="8640"/>
+        <w:tblBorders>
+          <w:top w:val="single" w:color="BFBFBF" w:sz="4"/>
+          <w:left w:val="single" w:color="BFBFBF" w:sz="4"/>
+          <w:bottom w:val="single" w:color="BFBFBF" w:sz="4"/>
+          <w:right w:val="single" w:color="BFBFBF" w:sz="4"/>
+          <w:insideH w:val="single" w:color="D9D9D9" w:sz="4"/>
+          <w:insideV w:val="single" w:color="D9D9D9" w:sz="4"/>
+        </w:tblBorders>
+      </w:tblPr>
+      <w:tblGrid>
+        <w:gridCol w:w="1900"/>
+        <w:gridCol w:w="2900"/>
+        <w:gridCol w:w="3840"/>
+      </w:tblGrid>
+      <w:tr>
+        <w:trPr>
+          <w:tblHeader/>
+        </w:trPr>
+        <w:tc>
+          <w:tcPr>
+            <w:tcW w:type="dxa" w:w="1900"/>
+            <w:shd w:fill="2E5496" w:color="auto" w:val="clear"/>
+            <w:tcMar>
+              <w:top w:type="dxa" w:w="60"/>
+              <w:left w:type="dxa" w:w="90"/>
+              <w:bottom w:type="dxa" w:w="60"/>
+              <w:right w:type="dxa" w:w="90"/>
+            </w:tcMar>
+          </w:tcPr>
+          <w:p>
+            <w:r>
+              <w:rPr>
+                <w:rFonts w:ascii="Calibri" w:cs="Calibri" w:eastAsia="Calibri" w:hAnsi="Calibri"/>
+                <w:b/>
+                <w:bCs/>
+                <w:color w:val="FFFFFF"/>
+                <w:sz w:val="18"/>
+                <w:szCs w:val="18"/>
+              </w:rPr>
+              <w:t xml:space="preserve">Name</w:t>
+            </w:r>
+          </w:p>
+        </w:tc>
+        <w:tc>
+          <w:tcPr>
+            <w:tcW w:type="dxa" w:w="2900"/>
+            <w:shd w:fill="2E5496" w:color="auto" w:val="clear"/>
+            <w:tcMar>
+              <w:top w:type="dxa" w:w="60"/>
+              <w:left w:type="dxa" w:w="90"/>
+              <w:bottom w:type="dxa" w:w="60"/>
+              <w:right w:type="dxa" w:w="90"/>
+            </w:tcMar>
+          </w:tcPr>
+          <w:p>
+            <w:r>
+              <w:rPr>
+                <w:rFonts w:ascii="Calibri" w:cs="Calibri" w:eastAsia="Calibri" w:hAnsi="Calibri"/>
+                <w:b/>
+                <w:bCs/>
+                <w:color w:val="FFFFFF"/>
+                <w:sz w:val="18"/>
+                <w:szCs w:val="18"/>
+              </w:rPr>
+              <w:t xml:space="preserve">Role</w:t>
+            </w:r>
+          </w:p>
+        </w:tc>
+        <w:tc>
+          <w:tcPr>
+            <w:tcW w:type="dxa" w:w="3840"/>
+            <w:shd w:fill="2E5496" w:color="auto" w:val="clear"/>
+            <w:tcMar>
+              <w:top w:type="dxa" w:w="60"/>
+              <w:left w:type="dxa" w:w="90"/>
+              <w:bottom w:type="dxa" w:w="60"/>
+              <w:right w:type="dxa" w:w="90"/>
+            </w:tcMar>
+          </w:tcPr>
+          <w:p>
+            <w:r>
+              <w:rPr>
+                <w:rFonts w:ascii="Calibri" w:cs="Calibri" w:eastAsia="Calibri" w:hAnsi="Calibri"/>
+                <w:b/>
+                <w:bCs/>
+                <w:color w:val="FFFFFF"/>
+                <w:sz w:val="18"/>
+                <w:szCs w:val="18"/>
+              </w:rPr>
+              <w:t xml:space="preserve">Why this door / how to reach</w:t>
+            </w:r>
+          </w:p>
+        </w:tc>
+      </w:tr>
+      <w:tr>
+        <w:tc>
+          <w:tcPr>
+            <w:tcW w:type="dxa" w:w="1900"/>
+            <w:tcMar>
+              <w:top w:type="dxa" w:w="60"/>
+              <w:left w:type="dxa" w:w="90"/>
+              <w:bottom w:type="dxa" w:w="60"/>
+              <w:right w:type="dxa" w:w="90"/>
+            </w:tcMar>
+          </w:tcPr>
+          <w:p>
+            <w:r>
+              <w:rPr>
+                <w:rFonts w:ascii="Calibri" w:cs="Calibri" w:eastAsia="Calibri" w:hAnsi="Calibri"/>
+                <w:b w:val="false"/>
+                <w:bCs w:val="false"/>
+                <w:color w:val="000000"/>
+                <w:sz w:val="18"/>
+                <w:szCs w:val="18"/>
+              </w:rPr>
+              <w:t xml:space="preserve">Peter Lehrman</w:t>
+            </w:r>
+          </w:p>
+        </w:tc>
+        <w:tc>
+          <w:tcPr>
+            <w:tcW w:type="dxa" w:w="2900"/>
+            <w:tcMar>
+              <w:top w:type="dxa" w:w="60"/>
+              <w:left w:type="dxa" w:w="90"/>
+              <w:bottom w:type="dxa" w:w="60"/>
+              <w:right w:type="dxa" w:w="90"/>
+            </w:tcMar>
+          </w:tcPr>
+          <w:p>
+            <w:r>
+              <w:rPr>
+                <w:rFonts w:ascii="Calibri" w:cs="Calibri" w:eastAsia="Calibri" w:hAnsi="Calibri"/>
+                <w:b w:val="false"/>
+                <w:bCs w:val="false"/>
+                <w:color w:val="000000"/>
+                <w:sz w:val="18"/>
+                <w:szCs w:val="18"/>
+              </w:rPr>
+              <w:t xml:space="preserve">Founder &amp; CEO</w:t>
+            </w:r>
+          </w:p>
+        </w:tc>
+        <w:tc>
+          <w:tcPr>
+            <w:tcW w:type="dxa" w:w="3840"/>
+            <w:tcMar>
+              <w:top w:type="dxa" w:w="60"/>
+              <w:left w:type="dxa" w:w="90"/>
+              <w:bottom w:type="dxa" w:w="60"/>
+              <w:right w:type="dxa" w:w="90"/>
+            </w:tcMar>
+          </w:tcPr>
+          <w:p>
+            <w:r>
+              <w:rPr>
+                <w:rFonts w:ascii="Calibri" w:cs="Calibri" w:eastAsia="Calibri" w:hAnsi="Calibri"/>
+                <w:b w:val="false"/>
+                <w:bCs w:val="false"/>
+                <w:color w:val="000000"/>
+                <w:sz w:val="18"/>
+                <w:szCs w:val="18"/>
+              </w:rPr>
+              <w:t xml:space="preserve">Best first door for a strategic channel partnership founder-to-founder. LinkedIn: /in/plehrman/</w:t>
+            </w:r>
+          </w:p>
+        </w:tc>
+      </w:tr>
+      <w:tr>
+        <w:tc>
+          <w:tcPr>
+            <w:tcW w:type="dxa" w:w="1900"/>
+            <w:shd w:fill="EEF2F8" w:color="auto" w:val="clear"/>
+            <w:tcMar>
+              <w:top w:type="dxa" w:w="60"/>
+              <w:left w:type="dxa" w:w="90"/>
+              <w:bottom w:type="dxa" w:w="60"/>
+              <w:right w:type="dxa" w:w="90"/>
+            </w:tcMar>
+          </w:tcPr>
+          <w:p>
+            <w:r>
+              <w:rPr>
+                <w:rFonts w:ascii="Calibri" w:cs="Calibri" w:eastAsia="Calibri" w:hAnsi="Calibri"/>
+                <w:b w:val="false"/>
+                <w:bCs w:val="false"/>
+                <w:color w:val="000000"/>
+                <w:sz w:val="18"/>
+                <w:szCs w:val="18"/>
+              </w:rPr>
+              <w:t xml:space="preserve">Nick Coetzee</w:t>
+            </w:r>
+          </w:p>
+        </w:tc>
+        <w:tc>
+          <w:tcPr>
+            <w:tcW w:type="dxa" w:w="2900"/>
+            <w:shd w:fill="EEF2F8" w:color="auto" w:val="clear"/>
+            <w:tcMar>
+              <w:top w:type="dxa" w:w="60"/>
+              <w:left w:type="dxa" w:w="90"/>
+              <w:bottom w:type="dxa" w:w="60"/>
+              <w:right w:type="dxa" w:w="90"/>
+            </w:tcMar>
+          </w:tcPr>
+          <w:p>
+            <w:r>
+              <w:rPr>
+                <w:rFonts w:ascii="Calibri" w:cs="Calibri" w:eastAsia="Calibri" w:hAnsi="Calibri"/>
+                <w:b w:val="false"/>
+                <w:bCs w:val="false"/>
+                <w:color w:val="000000"/>
+                <w:sz w:val="18"/>
+                <w:szCs w:val="18"/>
+              </w:rPr>
+              <w:t xml:space="preserve">Chief of Staff &amp; VP, Operations</w:t>
+            </w:r>
+          </w:p>
+        </w:tc>
+        <w:tc>
+          <w:tcPr>
+            <w:tcW w:type="dxa" w:w="3840"/>
+            <w:shd w:fill="EEF2F8" w:color="auto" w:val="clear"/>
+            <w:tcMar>
+              <w:top w:type="dxa" w:w="60"/>
+              <w:left w:type="dxa" w:w="90"/>
+              <w:bottom w:type="dxa" w:w="60"/>
+              <w:right w:type="dxa" w:w="90"/>
+            </w:tcMar>
+          </w:tcPr>
+          <w:p>
+            <w:r>
+              <w:rPr>
+                <w:rFonts w:ascii="Calibri" w:cs="Calibri" w:eastAsia="Calibri" w:hAnsi="Calibri"/>
+                <w:b w:val="false"/>
+                <w:bCs w:val="false"/>
+                <w:color w:val="000000"/>
+                <w:sz w:val="18"/>
+                <w:szCs w:val="18"/>
+              </w:rPr>
+              <w:t xml:space="preserve">Owns growth strategy, people, finance, ops — the role that typically owns partnerships at Axial's size</w:t>
+            </w:r>
+          </w:p>
+        </w:tc>
+      </w:tr>
+      <w:tr>
+        <w:tc>
+          <w:tcPr>
+            <w:tcW w:type="dxa" w:w="1900"/>
+            <w:tcMar>
+              <w:top w:type="dxa" w:w="60"/>
+              <w:left w:type="dxa" w:w="90"/>
+              <w:bottom w:type="dxa" w:w="60"/>
+              <w:right w:type="dxa" w:w="90"/>
+            </w:tcMar>
+          </w:tcPr>
+          <w:p>
+            <w:r>
+              <w:rPr>
+                <w:rFonts w:ascii="Calibri" w:cs="Calibri" w:eastAsia="Calibri" w:hAnsi="Calibri"/>
+                <w:b w:val="false"/>
+                <w:bCs w:val="false"/>
+                <w:color w:val="000000"/>
+                <w:sz w:val="18"/>
+                <w:szCs w:val="18"/>
+              </w:rPr>
+              <w:t xml:space="preserve">Alfredo Garcia</w:t>
+            </w:r>
+          </w:p>
+        </w:tc>
+        <w:tc>
+          <w:tcPr>
+            <w:tcW w:type="dxa" w:w="2900"/>
+            <w:tcMar>
+              <w:top w:type="dxa" w:w="60"/>
+              <w:left w:type="dxa" w:w="90"/>
+              <w:bottom w:type="dxa" w:w="60"/>
+              <w:right w:type="dxa" w:w="90"/>
+            </w:tcMar>
+          </w:tcPr>
+          <w:p>
+            <w:r>
+              <w:rPr>
+                <w:rFonts w:ascii="Calibri" w:cs="Calibri" w:eastAsia="Calibri" w:hAnsi="Calibri"/>
+                <w:b w:val="false"/>
+                <w:bCs w:val="false"/>
+                <w:color w:val="000000"/>
+                <w:sz w:val="18"/>
+                <w:szCs w:val="18"/>
+              </w:rPr>
+              <w:t xml:space="preserve">Director, Head of Sell-Side</w:t>
+            </w:r>
+          </w:p>
+        </w:tc>
+        <w:tc>
+          <w:tcPr>
+            <w:tcW w:type="dxa" w:w="3840"/>
+            <w:tcMar>
+              <w:top w:type="dxa" w:w="60"/>
+              <w:left w:type="dxa" w:w="90"/>
+              <w:bottom w:type="dxa" w:w="60"/>
+              <w:right w:type="dxa" w:w="90"/>
+            </w:tcMar>
+          </w:tcPr>
+          <w:p>
+            <w:r>
+              <w:rPr>
+                <w:rFonts w:ascii="Calibri" w:cs="Calibri" w:eastAsia="Calibri" w:hAnsi="Calibri"/>
+                <w:b w:val="false"/>
+                <w:bCs w:val="false"/>
+                <w:color w:val="000000"/>
+                <w:sz w:val="18"/>
+                <w:szCs w:val="18"/>
+              </w:rPr>
+              <w:t xml:space="preserve">Leads go-to-market; a commercial door if the CEO route stalls</w:t>
+            </w:r>
+          </w:p>
+        </w:tc>
+      </w:tr>
+      <w:tr>
+        <w:tc>
+          <w:tcPr>
+            <w:tcW w:type="dxa" w:w="1900"/>
+            <w:shd w:fill="EEF2F8" w:color="auto" w:val="clear"/>
+            <w:tcMar>
+              <w:top w:type="dxa" w:w="60"/>
+              <w:left w:type="dxa" w:w="90"/>
+              <w:bottom w:type="dxa" w:w="60"/>
+              <w:right w:type="dxa" w:w="90"/>
+            </w:tcMar>
+          </w:tcPr>
+          <w:p>
+            <w:r>
+              <w:rPr>
+                <w:rFonts w:ascii="Calibri" w:cs="Calibri" w:eastAsia="Calibri" w:hAnsi="Calibri"/>
+                <w:b w:val="false"/>
+                <w:bCs w:val="false"/>
+                <w:color w:val="000000"/>
+                <w:sz w:val="18"/>
+                <w:szCs w:val="18"/>
+              </w:rPr>
+              <w:t xml:space="preserve">Mark Romeo</w:t>
+            </w:r>
+          </w:p>
+        </w:tc>
+        <w:tc>
+          <w:tcPr>
+            <w:tcW w:type="dxa" w:w="2900"/>
+            <w:shd w:fill="EEF2F8" w:color="auto" w:val="clear"/>
+            <w:tcMar>
+              <w:top w:type="dxa" w:w="60"/>
+              <w:left w:type="dxa" w:w="90"/>
+              <w:bottom w:type="dxa" w:w="60"/>
+              <w:right w:type="dxa" w:w="90"/>
+            </w:tcMar>
+          </w:tcPr>
+          <w:p>
+            <w:r>
+              <w:rPr>
+                <w:rFonts w:ascii="Calibri" w:cs="Calibri" w:eastAsia="Calibri" w:hAnsi="Calibri"/>
+                <w:b w:val="false"/>
+                <w:bCs w:val="false"/>
+                <w:color w:val="000000"/>
+                <w:sz w:val="18"/>
+                <w:szCs w:val="18"/>
+              </w:rPr>
+              <w:t xml:space="preserve">Director, Member/Customer Success</w:t>
+            </w:r>
+          </w:p>
+        </w:tc>
+        <w:tc>
+          <w:tcPr>
+            <w:tcW w:type="dxa" w:w="3840"/>
+            <w:shd w:fill="EEF2F8" w:color="auto" w:val="clear"/>
+            <w:tcMar>
+              <w:top w:type="dxa" w:w="60"/>
+              <w:left w:type="dxa" w:w="90"/>
+              <w:bottom w:type="dxa" w:w="60"/>
+              <w:right w:type="dxa" w:w="90"/>
+            </w:tcMar>
+          </w:tcPr>
+          <w:p>
+            <w:r>
+              <w:rPr>
+                <w:rFonts w:ascii="Calibri" w:cs="Calibri" w:eastAsia="Calibri" w:hAnsi="Calibri"/>
+                <w:b w:val="false"/>
+                <w:bCs w:val="false"/>
+                <w:color w:val="000000"/>
+                <w:sz w:val="18"/>
+                <w:szCs w:val="18"/>
+              </w:rPr>
+              <w:t xml:space="preserve">Owns the buy-side member relationship (the independent sponsors); useful context/warm intro</w:t>
+            </w:r>
+          </w:p>
+        </w:tc>
+      </w:tr>
+    </w:tbl>
+    <w:p>
+      <w:pPr>
+        <w:spacing w:after="120" w:line="276"/>
+      </w:pPr>
+      <w:r>
+        <w:rPr>
+          <w:rFonts w:ascii="Calibri" w:cs="Calibri" w:eastAsia="Calibri" w:hAnsi="Calibri"/>
+          <w:b/>
+          <w:bCs/>
+          <w:sz w:val="21"/>
+          <w:szCs w:val="21"/>
+        </w:rPr>
+        <w:t xml:space="preserve">A warm, in-person route: </w:t>
+      </w:r>
+      <w:r>
+        <w:rPr>
+          <w:rFonts w:ascii="Calibri" w:cs="Calibri" w:eastAsia="Calibri" w:hAnsi="Calibri"/>
+          <w:sz w:val="21"/>
+          <w:szCs w:val="21"/>
+        </w:rPr>
+        <w:t xml:space="preserve">because Axial powers SBIA's deal sourcing, the SBIA Independent Sponsor Forum / Deal Series events (Dallas Mar 3, Philadelphia May 6, Chicago Sept, LA Nov — 2026) put Axial's team and independent sponsors in the same room. Attending one is a way to meet Axial and prospective ICOs at once.</w:t>
+      </w:r>
+    </w:p>
+    <w:p>
+      <w:pPr>
+        <w:spacing w:after="120" w:line="276"/>
+      </w:pPr>
+      <w:r>
+        <w:rPr>
+          <w:rFonts w:ascii="Calibri" w:cs="Calibri" w:eastAsia="Calibri" w:hAnsi="Calibri"/>
           <w:b/>
           <w:bCs/>
           <w:sz w:val="21"/>
@@ -2341,7 +2812,7 @@
           <w:sz w:val="21"/>
           <w:szCs w:val="21"/>
         </w:rPr>
-        <w:t xml:space="preserve">(these are the real, checkable routes — I did not invent individual names or emails):</w:t>
+        <w:t xml:space="preserve">(the real, checkable routes — I did not invent individual emails):</w:t>
       </w:r>
     </w:p>
     <w:tbl>
@@ -2795,7 +3266,7 @@
           <w:sz w:val="21"/>
           <w:szCs w:val="21"/>
         </w:rPr>
-        <w:t xml:space="preserve">the channels above are public and current; I won't put a specific person's name/email in writing without verifying it live — the team page plus Sales Navigator will get you the right individual quickly.</w:t>
+        <w:t xml:space="preserve">names and roles above come from public sources (LinkedIn, company profiles) and are current to the best of my checking as of July 2026; I have not published personal email addresses because I could not verify them — pull those via Apollo / Sales Navigator, and re-confirm each title before you send.</w:t>
       </w:r>
     </w:p>
     <w:p>
@@ -2955,6 +3426,29 @@
           <w:szCs w:val="21"/>
         </w:rPr>
         <w:t xml:space="preserve">~5 mobile + 10 export credits, ~250 emails/day, 2 active sequences. Fine for a first list; upgrade when exports run out.</w:t>
+      </w:r>
+    </w:p>
+    <w:p>
+      <w:pPr>
+        <w:spacing w:after="120" w:line="276"/>
+      </w:pPr>
+      <w:r>
+        <w:rPr>
+          <w:rFonts w:ascii="Calibri" w:cs="Calibri" w:eastAsia="Calibri" w:hAnsi="Calibri"/>
+          <w:b/>
+          <w:bCs/>
+          <w:sz w:val="21"/>
+          <w:szCs w:val="21"/>
+        </w:rPr>
+        <w:t xml:space="preserve">Starter workbook provided: </w:t>
+      </w:r>
+      <w:r>
+        <w:rPr>
+          <w:rFonts w:ascii="Calibri" w:cs="Calibri" w:eastAsia="Calibri" w:hAnsi="Calibri"/>
+          <w:sz w:val="21"/>
+          <w:szCs w:val="21"/>
+        </w:rPr>
+        <w:t xml:space="preserve">PIVT_ICO_Target_List.xlsx accompanies this report. It has an Apollo-ready import template, a “best free seed sources” tab (including Axial's own public independent-sponsor directories), and this search recipe. Note: I can't create the Apollo account for you — signup needs your email verification — but the list is ready to import the moment you're in.</w:t>
       </w:r>
     </w:p>
     <w:p>

</xml_diff>